<commit_message>
docs: update handover for on-prem SQL Server
Co-Authored-By: claude-flow <ruv@ruv.net>
</commit_message>
<xml_diff>
--- a/docs/HANDOVER.docx
+++ b/docs/HANDOVER.docx
@@ -288,7 +288,7 @@
                 <w:sz w:val="18"/>
                 <w:szCs w:val="18"/>
               </w:rPr>
-              <w:t xml:space="preserve">Microsoft SQL Server, database CMSDB_21052026, port 1433. Legacy schema (ORDER_HEADER, INVOICE_HEADER, ACCOUNT_MST, USER_MANAGEMENT, etc.).</w:t>
+              <w:t xml:space="preserve">Microsoft SQL Server — runs on your own physical server. Database name: CMSDB_21052026 (configurable via MSSQL_DATABASE). Uses the legacy schema: ORDER_HEADER, INVOICE_HEADER, ACCOUNT_MST, USER_MANAGEMENT, etc.</w:t>
             </w:r>
           </w:p>
         </w:tc>
@@ -368,7 +368,7 @@
           <w:b/>
           <w:bCs/>
         </w:rPr>
-        <w:t xml:space="preserve">IMPORTANT: MongoDB is NOT used anymore. The project was migrated from MongoDB/Mongoose to SQL Server. If you see a MongoDB connection error, you are running stale code — run git pull. Remove MONGO_URI from any .env file you received.</w:t>
+        <w:t xml:space="preserve">The application expects the existing CMSDB schema to be present on your SQL Server. Restore/attach the database on your server before starting the backend.</w:t>
       </w:r>
     </w:p>
     <w:p>
@@ -415,7 +415,20 @@
         <w:spacing w:after="60"/>
       </w:pPr>
       <w:r>
-        <w:t xml:space="preserve">Copy backend/.env.example to backend/.env and fill in every value (see Section 4).</w:t>
+        <w:t xml:space="preserve">Make sure the CMSDB database is restored and running on your SQL Server, and that SQL Server authentication (username/password login) is enabled with TCP/IP on port 1433.</w:t>
+      </w:r>
+    </w:p>
+    <w:p>
+      <w:pPr>
+        <w:pStyle w:val="ListParagraph"/>
+        <w:numPr>
+          <w:ilvl w:val="0"/>
+          <w:numId w:val="2"/>
+        </w:numPr>
+        <w:spacing w:after="60"/>
+      </w:pPr>
+      <w:r>
+        <w:t xml:space="preserve">Copy backend/.env.example to backend/.env and fill in every value (see Section 4), pointing MSSQL_HOST at your own SQL Server.</w:t>
       </w:r>
     </w:p>
     <w:p>
@@ -602,7 +615,7 @@
                 <w:sz w:val="18"/>
                 <w:szCs w:val="18"/>
               </w:rPr>
-              <w:t xml:space="preserve">SQL Server hostname or IP (required)</w:t>
+              <w:t xml:space="preserve">Your SQL Server hostname or IP — e.g. localhost or 192.168.x.x (required)</w:t>
             </w:r>
           </w:p>
         </w:tc>
@@ -659,7 +672,7 @@
                 <w:sz w:val="18"/>
                 <w:szCs w:val="18"/>
               </w:rPr>
-              <w:t xml:space="preserve">1433 (default)</w:t>
+              <w:t xml:space="preserve">1433 (default). Leave unset if connecting to a named instance.</w:t>
             </w:r>
           </w:p>
         </w:tc>
@@ -687,7 +700,7 @@
                 <w:b w:val="false"/>
                 <w:bCs w:val="false"/>
               </w:rPr>
-              <w:t xml:space="preserve">MSSQL_DATABASE</w:t>
+              <w:t xml:space="preserve">MSSQL_INSTANCE</w:t>
             </w:r>
           </w:p>
         </w:tc>
@@ -716,7 +729,7 @@
                 <w:sz w:val="18"/>
                 <w:szCs w:val="18"/>
               </w:rPr>
-              <w:t xml:space="preserve">CMSDB_21052026</w:t>
+              <w:t xml:space="preserve">Named instance (e.g. SQLEXPRESS) — only if not using a port</w:t>
             </w:r>
           </w:p>
         </w:tc>
@@ -744,7 +757,7 @@
                 <w:b w:val="false"/>
                 <w:bCs w:val="false"/>
               </w:rPr>
-              <w:t xml:space="preserve">MSSQL_USER / MSSQL_PASSWORD</w:t>
+              <w:t xml:space="preserve">MSSQL_DATABASE</w:t>
             </w:r>
           </w:p>
         </w:tc>
@@ -773,7 +786,7 @@
                 <w:sz w:val="18"/>
                 <w:szCs w:val="18"/>
               </w:rPr>
-              <w:t xml:space="preserve">SQL Server credentials (required)</w:t>
+              <w:t xml:space="preserve">CMSDB_21052026 (change if your database name differs)</w:t>
             </w:r>
           </w:p>
         </w:tc>
@@ -801,7 +814,7 @@
                 <w:b w:val="false"/>
                 <w:bCs w:val="false"/>
               </w:rPr>
-              <w:t xml:space="preserve">MSSQL_ENCRYPT</w:t>
+              <w:t xml:space="preserve">MSSQL_USER / MSSQL_PASSWORD</w:t>
             </w:r>
           </w:p>
         </w:tc>
@@ -830,7 +843,7 @@
                 <w:sz w:val="18"/>
                 <w:szCs w:val="18"/>
               </w:rPr>
-              <w:t xml:space="preserve">true in production</w:t>
+              <w:t xml:space="preserve">SQL Server authentication credentials (required; Windows auth is not supported)</w:t>
             </w:r>
           </w:p>
         </w:tc>
@@ -858,7 +871,7 @@
                 <w:b w:val="false"/>
                 <w:bCs w:val="false"/>
               </w:rPr>
-              <w:t xml:space="preserve">MSSQL_TRUST_CERT</w:t>
+              <w:t xml:space="preserve">MSSQL_ENCRYPT</w:t>
             </w:r>
           </w:p>
         </w:tc>
@@ -887,7 +900,64 @@
                 <w:sz w:val="18"/>
                 <w:szCs w:val="18"/>
               </w:rPr>
-              <w:t xml:space="preserve">true (self-signed server certificate)</w:t>
+              <w:t xml:space="preserve">true recommended; false is acceptable on a trusted local network</w:t>
+            </w:r>
+          </w:p>
+        </w:tc>
+      </w:tr>
+      <w:tr>
+        <w:tc>
+          <w:tcPr>
+            <w:tcW w:type="dxa" w:w="3000"/>
+            <w:tcBorders>
+              <w:top w:val="single" w:color="CCCCCC" w:sz="1"/>
+              <w:left w:val="single" w:color="CCCCCC" w:sz="1"/>
+              <w:bottom w:val="single" w:color="CCCCCC" w:sz="1"/>
+              <w:right w:val="single" w:color="CCCCCC" w:sz="1"/>
+            </w:tcBorders>
+            <w:tcMar>
+              <w:top w:type="dxa" w:w="80"/>
+              <w:left w:type="dxa" w:w="120"/>
+              <w:bottom w:type="dxa" w:w="80"/>
+              <w:right w:type="dxa" w:w="120"/>
+            </w:tcMar>
+          </w:tcPr>
+          <w:p>
+            <w:r>
+              <w:rPr>
+                <w:b w:val="false"/>
+                <w:bCs w:val="false"/>
+              </w:rPr>
+              <w:t xml:space="preserve">MSSQL_TRUST_CERT</w:t>
+            </w:r>
+          </w:p>
+        </w:tc>
+        <w:tc>
+          <w:tcPr>
+            <w:tcW w:type="dxa" w:w="6360"/>
+            <w:tcBorders>
+              <w:top w:val="single" w:color="CCCCCC" w:sz="1"/>
+              <w:left w:val="single" w:color="CCCCCC" w:sz="1"/>
+              <w:bottom w:val="single" w:color="CCCCCC" w:sz="1"/>
+              <w:right w:val="single" w:color="CCCCCC" w:sz="1"/>
+            </w:tcBorders>
+            <w:tcMar>
+              <w:top w:type="dxa" w:w="80"/>
+              <w:left w:type="dxa" w:w="120"/>
+              <w:bottom w:type="dxa" w:w="80"/>
+              <w:right w:type="dxa" w:w="120"/>
+            </w:tcMar>
+          </w:tcPr>
+          <w:p>
+            <w:r>
+              <w:rPr>
+                <w:rFonts w:ascii="Consolas" w:cs="Consolas" w:eastAsia="Consolas" w:hAnsi="Consolas"/>
+                <w:b w:val="false"/>
+                <w:bCs w:val="false"/>
+                <w:sz w:val="18"/>
+                <w:szCs w:val="18"/>
+              </w:rPr>
+              <w:t xml:space="preserve">true (SQL Server self-signed certificate)</w:t>
             </w:r>
           </w:p>
         </w:tc>
@@ -1140,19 +1210,6 @@
       </w:pPr>
       <w:r>
         <w:t xml:space="preserve">6. Security Notes — Read Before Going Live</w:t>
-      </w:r>
-    </w:p>
-    <w:p>
-      <w:pPr>
-        <w:pStyle w:val="ListParagraph"/>
-        <w:numPr>
-          <w:ilvl w:val="0"/>
-          <w:numId w:val="3"/>
-        </w:numPr>
-        <w:spacing w:after="60"/>
-      </w:pPr>
-      <w:r>
-        <w:t xml:space="preserve">The old MongoDB Atlas connection string (with credentials) exists in git history. The previous owner must delete or rotate that Atlas cluster. It is no longer used by the app.</w:t>
       </w:r>
     </w:p>
     <w:p>

</xml_diff>